<commit_message>
docs: nicer local sample image (gradient, Markdown to Mermaid to Word motif), explicit image widths
Co-Authored-By: Claude Sonnet 5.5 <noreply@anthropic.com>
</commit_message>
<xml_diff>
--- a/docs/manual/manuel-utilisateur.docx
+++ b/docs/manual/manuel-utilisateur.docx
@@ -4158,7 +4158,7 @@
       <w:r>
         <w:drawing>
           <wp:inline>
-            <wp:extent cx="6096000" cy="3048000"/>
+            <wp:extent cx="3710940" cy="1855470"/>
             <wp:effectExtent b="0" l="0" r="0" t="0"/>
             <wp:docPr descr="Image de test locale (PNG)" title="" id="44" name="Picture"/>
             <a:graphic>
@@ -4179,7 +4179,7 @@
                   <pic:spPr bwMode="auto">
                     <a:xfrm>
                       <a:off x="0" y="0"/>
-                      <a:ext cx="6096000" cy="3048000"/>
+                      <a:ext cx="3710940" cy="1855470"/>
                     </a:xfrm>
                     <a:prstGeom prst="rect">
                       <a:avLst/>
@@ -4211,7 +4211,7 @@
         <w:pStyle w:val="BodyText"/>
       </w:pPr>
       <w:r>
-        <w:t xml:space="preserve">Image redimensionnée à 50 % :</w:t>
+        <w:t xml:space="preserve">Image redimensionnée à 30 % :</w:t>
       </w:r>
     </w:p>
     <w:p>
@@ -4221,9 +4221,9 @@
       <w:r>
         <w:drawing>
           <wp:inline>
-            <wp:extent cx="3092450" cy="1546225"/>
+            <wp:extent cx="1855470" cy="927735"/>
             <wp:effectExtent b="0" l="0" r="0" t="0"/>
-            <wp:docPr descr="Même image, 50 %" title="" id="46" name="Picture"/>
+            <wp:docPr descr="Même image, 30 %" title="" id="46" name="Picture"/>
             <a:graphic>
               <a:graphicData uri="http://schemas.openxmlformats.org/drawingml/2006/picture">
                 <pic:pic>
@@ -4242,7 +4242,7 @@
                   <pic:spPr bwMode="auto">
                     <a:xfrm>
                       <a:off x="0" y="0"/>
-                      <a:ext cx="3092450" cy="1546225"/>
+                      <a:ext cx="1855470" cy="927735"/>
                     </a:xfrm>
                     <a:prstGeom prst="rect">
                       <a:avLst/>
@@ -4266,7 +4266,7 @@
         <w:pStyle w:val="ImageCaption"/>
       </w:pPr>
       <w:r>
-        <w:t xml:space="preserve">Même image, 50 %</w:t>
+        <w:t xml:space="preserve">Même image, 30 %</w:t>
       </w:r>
     </w:p>
     <w:bookmarkEnd w:id="48"/>

</xml_diff>